<commit_message>
ajuste en el nombre de un participante en el informe final
</commit_message>
<xml_diff>
--- a/informe final desafío 1.docx
+++ b/informe final desafío 1.docx
@@ -34,7 +34,7 @@
           <w:sz w:val="28"/>
           <w:szCs w:val="28"/>
         </w:rPr>
-        <w:t xml:space="preserve">Estevan </w:t>
+        <w:t>Este</w:t>
       </w:r>
       <w:r>
         <w:rPr>
@@ -42,7 +42,7 @@
           <w:sz w:val="28"/>
           <w:szCs w:val="28"/>
         </w:rPr>
-        <w:t>Gutiérrez &amp;</w:t>
+        <w:t>b</w:t>
       </w:r>
       <w:r>
         <w:rPr>
@@ -50,7 +50,7 @@
           <w:sz w:val="28"/>
           <w:szCs w:val="28"/>
         </w:rPr>
-        <w:t xml:space="preserve"> David</w:t>
+        <w:t xml:space="preserve">an </w:t>
       </w:r>
       <w:r>
         <w:rPr>
@@ -58,16 +58,15 @@
           <w:sz w:val="28"/>
           <w:szCs w:val="28"/>
         </w:rPr>
-        <w:t xml:space="preserve"> </w:t>
-      </w:r>
-      <w:proofErr w:type="gramStart"/>
+        <w:t>Gutiérrez &amp;</w:t>
+      </w:r>
       <w:r>
         <w:rPr>
           <w:rFonts w:ascii="Times New Roman" w:hAnsi="Times New Roman" w:cs="Times New Roman"/>
           <w:sz w:val="28"/>
           <w:szCs w:val="28"/>
         </w:rPr>
-        <w:t xml:space="preserve">Antonio </w:t>
+        <w:t xml:space="preserve"> David</w:t>
       </w:r>
       <w:r>
         <w:rPr>
@@ -75,16 +74,15 @@
           <w:sz w:val="28"/>
           <w:szCs w:val="28"/>
         </w:rPr>
-        <w:t xml:space="preserve"> Colmenares</w:t>
-      </w:r>
-      <w:proofErr w:type="gramEnd"/>
+        <w:t xml:space="preserve"> Antonio </w:t>
+      </w:r>
       <w:r>
         <w:rPr>
           <w:rFonts w:ascii="Times New Roman" w:hAnsi="Times New Roman" w:cs="Times New Roman"/>
           <w:sz w:val="28"/>
           <w:szCs w:val="28"/>
         </w:rPr>
-        <w:t xml:space="preserve"> </w:t>
+        <w:t xml:space="preserve">Colmenares </w:t>
       </w:r>
     </w:p>
     <w:p>
@@ -2516,6 +2514,7 @@
         <w:pStyle w:val="Ttulo2"/>
       </w:pPr>
       <w:r>
+        <w:lastRenderedPageBreak/>
         <w:t xml:space="preserve">Evolución </w:t>
       </w:r>
     </w:p>
@@ -2881,7 +2880,6 @@
         <w:pStyle w:val="Ttulo2"/>
       </w:pPr>
       <w:r>
-        <w:lastRenderedPageBreak/>
         <w:t xml:space="preserve">Esquema </w:t>
       </w:r>
       <w:r>
@@ -2974,6 +2972,7 @@
               <w:rPr>
                 <w:rFonts w:ascii="Times New Roman" w:hAnsi="Times New Roman" w:cs="Times New Roman"/>
               </w:rPr>
+              <w:lastRenderedPageBreak/>
               <w:t>Arquitectura Modular y Multiarchivo</w:t>
             </w:r>
           </w:p>
@@ -3497,7 +3496,6 @@
         <w:rPr>
           <w:rFonts w:ascii="Times New Roman" w:hAnsi="Times New Roman" w:cs="Times New Roman"/>
         </w:rPr>
-        <w:lastRenderedPageBreak/>
         <w:t xml:space="preserve">La función </w:t>
       </w:r>
       <w:proofErr w:type="spellStart"/>

</xml_diff>